<commit_message>
Fix enlaces en App y Pelagia y preparar despliegue manual
</commit_message>
<xml_diff>
--- a/dist/Plan_Campana_Pelagia.docx
+++ b/dist/Plan_Campana_Pelagia.docx
@@ -4,31 +4,35 @@
   <w:body>
     <w:p>
       <w:pPr>
-        <w:pStyle w:val="Title"/>
-        <w:jc w:val="center"/>
+        <w:pStyle w:val="Heading1"/>
+        <w:widowControl/>
+        <w:suppressAutoHyphens w:val="true"/>
+        <w:bidi w:val="0"/>
+        <w:spacing w:lineRule="auto" w:line="276" w:before="480" w:after="0"/>
+        <w:jc w:val="left"/>
         <w:rPr/>
       </w:pPr>
       <w:r>
-        <w:rPr/>
+        <w:rPr>
+          <w:kern w:val="0"/>
+          <w:lang w:val="en-US" w:eastAsia="en-US" w:bidi="ar-SA"/>
+        </w:rPr>
         <w:t>PLAN DE CAMPAÑA Y SEGURIDAD - PELAGIA</w:t>
       </w:r>
     </w:p>
     <w:p>
       <w:pPr>
         <w:pStyle w:val="Heading1"/>
-        <w:rPr/>
+        <w:rPr>
+          <w:sz w:val="20"/>
+          <w:szCs w:val="20"/>
+        </w:rPr>
       </w:pPr>
       <w:r>
-        <w:rPr/>
-      </w:r>
-    </w:p>
-    <w:p>
-      <w:pPr>
-        <w:pStyle w:val="Heading1"/>
-        <w:rPr/>
-      </w:pPr>
-      <w:r>
-        <w:rPr/>
+        <w:rPr>
+          <w:sz w:val="20"/>
+          <w:szCs w:val="20"/>
+        </w:rPr>
         <w:t>1. Datos Generales de la Campaña</w:t>
       </w:r>
     </w:p>
@@ -75,10 +79,16 @@
     <w:p>
       <w:pPr>
         <w:pStyle w:val="Heading1"/>
-        <w:rPr/>
+        <w:rPr>
+          <w:sz w:val="20"/>
+          <w:szCs w:val="20"/>
+        </w:rPr>
       </w:pPr>
       <w:r>
-        <w:rPr/>
+        <w:rPr>
+          <w:sz w:val="20"/>
+          <w:szCs w:val="20"/>
+        </w:rPr>
         <w:t>2. Descripción de las Operaciones</w:t>
       </w:r>
     </w:p>
@@ -109,10 +119,16 @@
     <w:p>
       <w:pPr>
         <w:pStyle w:val="Heading1"/>
-        <w:rPr/>
+        <w:rPr>
+          <w:sz w:val="20"/>
+          <w:szCs w:val="20"/>
+        </w:rPr>
       </w:pPr>
       <w:r>
-        <w:rPr/>
+        <w:rPr>
+          <w:sz w:val="20"/>
+          <w:szCs w:val="20"/>
+        </w:rPr>
         <w:t>3. Prevención de Riesgos Laborales (PRL)</w:t>
       </w:r>
     </w:p>
@@ -173,10 +189,31 @@
     <w:p>
       <w:pPr>
         <w:pStyle w:val="Heading1"/>
-        <w:rPr/>
+        <w:rPr>
+          <w:sz w:val="20"/>
+          <w:szCs w:val="20"/>
+        </w:rPr>
       </w:pPr>
       <w:r>
-        <w:rPr/>
+        <w:rPr>
+          <w:sz w:val="20"/>
+          <w:szCs w:val="20"/>
+        </w:rPr>
+      </w:r>
+    </w:p>
+    <w:p>
+      <w:pPr>
+        <w:pStyle w:val="Heading1"/>
+        <w:rPr>
+          <w:sz w:val="20"/>
+          <w:szCs w:val="20"/>
+        </w:rPr>
+      </w:pPr>
+      <w:r>
+        <w:rPr>
+          <w:sz w:val="20"/>
+          <w:szCs w:val="20"/>
+        </w:rPr>
         <w:t>4. Coordinación de Actividades Empresariales (CAE)</w:t>
       </w:r>
     </w:p>
@@ -213,10 +250,16 @@
     <w:p>
       <w:pPr>
         <w:pStyle w:val="Heading1"/>
-        <w:rPr/>
+        <w:rPr>
+          <w:sz w:val="20"/>
+          <w:szCs w:val="20"/>
+        </w:rPr>
       </w:pPr>
       <w:r>
-        <w:rPr/>
+        <w:rPr>
+          <w:sz w:val="20"/>
+          <w:szCs w:val="20"/>
+        </w:rPr>
         <w:t>5. Compromiso y Firma</w:t>
       </w:r>
     </w:p>
@@ -262,10 +305,12 @@
       </w:r>
     </w:p>
     <w:sectPr>
-      <w:headerReference w:type="default" r:id="rId2"/>
+      <w:headerReference w:type="even" r:id="rId2"/>
+      <w:headerReference w:type="default" r:id="rId3"/>
+      <w:headerReference w:type="first" r:id="rId4"/>
       <w:type w:val="nextPage"/>
       <w:pgSz w:w="12240" w:h="15840"/>
-      <w:pgMar w:left="1800" w:right="1800" w:gutter="0" w:header="1735" w:top="1794" w:footer="0" w:bottom="1435"/>
+      <w:pgMar w:left="1800" w:right="1800" w:gutter="0" w:header="1517" w:top="1726" w:footer="0" w:bottom="1435"/>
       <w:pgNumType w:fmt="decimal"/>
       <w:formProt w:val="false"/>
       <w:textDirection w:val="lrTb"/>
@@ -284,14 +329,28 @@
     </w:pPr>
     <w:r>
       <w:rPr/>
+    </w:r>
+  </w:p>
+</w:hdr>
+</file>
+
+<file path=word/header2.xml><?xml version="1.0" encoding="utf-8"?>
+<w:hdr xmlns:o="urn:schemas-microsoft-com:office:office" xmlns:r="http://schemas.openxmlformats.org/officeDocument/2006/relationships" xmlns:v="urn:schemas-microsoft-com:vml" xmlns:w="http://schemas.openxmlformats.org/wordprocessingml/2006/main" xmlns:w10="urn:schemas-microsoft-com:office:word" xmlns:wp="http://schemas.openxmlformats.org/drawingml/2006/wordprocessingDrawing" xmlns:wps="http://schemas.microsoft.com/office/word/2010/wordprocessingShape" xmlns:wpg="http://schemas.microsoft.com/office/word/2010/wordprocessingGroup" xmlns:mc="http://schemas.openxmlformats.org/markup-compatibility/2006" xmlns:wp14="http://schemas.microsoft.com/office/word/2010/wordprocessingDrawing" xmlns:w14="http://schemas.microsoft.com/office/word/2010/wordml" xmlns:w15="http://schemas.microsoft.com/office/word/2012/wordml" mc:Ignorable="w14 wp14 w15">
+  <w:p>
+    <w:pPr>
+      <w:pStyle w:val="Header"/>
+      <w:rPr/>
+    </w:pPr>
+    <w:r>
+      <w:rPr/>
       <w:drawing>
-        <wp:anchor behindDoc="0" distT="0" distB="0" distL="0" distR="0" simplePos="0" locked="0" layoutInCell="0" allowOverlap="1" relativeHeight="2">
+        <wp:anchor behindDoc="1" distT="0" distB="0" distL="0" distR="0" simplePos="0" locked="0" layoutInCell="0" allowOverlap="1" relativeHeight="2">
           <wp:simplePos x="0" y="0"/>
           <wp:positionH relativeFrom="column">
-            <wp:posOffset>1564640</wp:posOffset>
+            <wp:posOffset>4445</wp:posOffset>
           </wp:positionH>
           <wp:positionV relativeFrom="paragraph">
-            <wp:posOffset>-870585</wp:posOffset>
+            <wp:posOffset>-630555</wp:posOffset>
           </wp:positionV>
           <wp:extent cx="2160270" cy="629920"/>
           <wp:effectExtent l="0" t="0" r="0" b="0"/>
@@ -334,6 +393,65 @@
 </w:hdr>
 </file>
 
+<file path=word/header3.xml><?xml version="1.0" encoding="utf-8"?>
+<w:hdr xmlns:o="urn:schemas-microsoft-com:office:office" xmlns:r="http://schemas.openxmlformats.org/officeDocument/2006/relationships" xmlns:v="urn:schemas-microsoft-com:vml" xmlns:w="http://schemas.openxmlformats.org/wordprocessingml/2006/main" xmlns:w10="urn:schemas-microsoft-com:office:word" xmlns:wp="http://schemas.openxmlformats.org/drawingml/2006/wordprocessingDrawing" xmlns:wps="http://schemas.microsoft.com/office/word/2010/wordprocessingShape" xmlns:wpg="http://schemas.microsoft.com/office/word/2010/wordprocessingGroup" xmlns:mc="http://schemas.openxmlformats.org/markup-compatibility/2006" xmlns:wp14="http://schemas.microsoft.com/office/word/2010/wordprocessingDrawing" xmlns:w14="http://schemas.microsoft.com/office/word/2010/wordml" xmlns:w15="http://schemas.microsoft.com/office/word/2012/wordml" mc:Ignorable="w14 wp14 w15">
+  <w:p>
+    <w:pPr>
+      <w:pStyle w:val="Header"/>
+      <w:rPr/>
+    </w:pPr>
+    <w:r>
+      <w:rPr/>
+      <w:drawing>
+        <wp:anchor behindDoc="1" distT="0" distB="0" distL="0" distR="0" simplePos="0" locked="0" layoutInCell="0" allowOverlap="1" relativeHeight="2">
+          <wp:simplePos x="0" y="0"/>
+          <wp:positionH relativeFrom="column">
+            <wp:posOffset>4445</wp:posOffset>
+          </wp:positionH>
+          <wp:positionV relativeFrom="paragraph">
+            <wp:posOffset>-630555</wp:posOffset>
+          </wp:positionV>
+          <wp:extent cx="2160270" cy="629920"/>
+          <wp:effectExtent l="0" t="0" r="0" b="0"/>
+          <wp:wrapSquare wrapText="largest"/>
+          <wp:docPr id="2" name="Imagen1" descr=""/>
+          <wp:cNvGraphicFramePr>
+            <a:graphicFrameLocks xmlns:a="http://schemas.openxmlformats.org/drawingml/2006/main" noChangeAspect="1"/>
+          </wp:cNvGraphicFramePr>
+          <a:graphic xmlns:a="http://schemas.openxmlformats.org/drawingml/2006/main">
+            <a:graphicData uri="http://schemas.openxmlformats.org/drawingml/2006/picture">
+              <pic:pic xmlns:pic="http://schemas.openxmlformats.org/drawingml/2006/picture">
+                <pic:nvPicPr>
+                  <pic:cNvPr id="2" name="Imagen1" descr=""/>
+                  <pic:cNvPicPr>
+                    <a:picLocks noChangeAspect="1" noChangeArrowheads="1"/>
+                  </pic:cNvPicPr>
+                </pic:nvPicPr>
+                <pic:blipFill>
+                  <a:blip r:embed="rId1"/>
+                  <a:stretch>
+                    <a:fillRect/>
+                  </a:stretch>
+                </pic:blipFill>
+                <pic:spPr bwMode="auto">
+                  <a:xfrm>
+                    <a:off x="0" y="0"/>
+                    <a:ext cx="2160270" cy="629920"/>
+                  </a:xfrm>
+                  <a:prstGeom prst="rect">
+                    <a:avLst/>
+                  </a:prstGeom>
+                </pic:spPr>
+              </pic:pic>
+            </a:graphicData>
+          </a:graphic>
+        </wp:anchor>
+      </w:drawing>
+    </w:r>
+  </w:p>
+</w:hdr>
+</file>
+
 <file path=word/numbering.xml><?xml version="1.0" encoding="utf-8"?>
 <w:numbering xmlns:w="http://schemas.openxmlformats.org/wordprocessingml/2006/main" xmlns:o="urn:schemas-microsoft-com:office:office" xmlns:r="http://schemas.openxmlformats.org/officeDocument/2006/relationships" xmlns:v="urn:schemas-microsoft-com:vml" xmlns:mc="http://schemas.openxmlformats.org/markup-compatibility/2006" xmlns:w14="http://schemas.microsoft.com/office/word/2010/wordml" mc:Ignorable="w14">
   <w:abstractNum w:abstractNumId="1">
@@ -363,6 +481,7 @@
         </w:tabs>
         <w:ind w:left="1080" w:hanging="360"/>
       </w:pPr>
+      <w:rPr/>
     </w:lvl>
     <w:lvl w:ilvl="2">
       <w:start w:val="1"/>
@@ -375,6 +494,7 @@
         </w:tabs>
         <w:ind w:left="1440" w:hanging="360"/>
       </w:pPr>
+      <w:rPr/>
     </w:lvl>
     <w:lvl w:ilvl="3">
       <w:start w:val="1"/>
@@ -387,6 +507,7 @@
         </w:tabs>
         <w:ind w:left="1800" w:hanging="360"/>
       </w:pPr>
+      <w:rPr/>
     </w:lvl>
     <w:lvl w:ilvl="4">
       <w:start w:val="1"/>
@@ -399,6 +520,7 @@
         </w:tabs>
         <w:ind w:left="2160" w:hanging="360"/>
       </w:pPr>
+      <w:rPr/>
     </w:lvl>
     <w:lvl w:ilvl="5">
       <w:start w:val="1"/>
@@ -411,6 +533,7 @@
         </w:tabs>
         <w:ind w:left="2520" w:hanging="360"/>
       </w:pPr>
+      <w:rPr/>
     </w:lvl>
     <w:lvl w:ilvl="6">
       <w:start w:val="1"/>
@@ -423,6 +546,7 @@
         </w:tabs>
         <w:ind w:left="2880" w:hanging="360"/>
       </w:pPr>
+      <w:rPr/>
     </w:lvl>
     <w:lvl w:ilvl="7">
       <w:start w:val="1"/>
@@ -435,6 +559,7 @@
         </w:tabs>
         <w:ind w:left="3240" w:hanging="360"/>
       </w:pPr>
+      <w:rPr/>
     </w:lvl>
     <w:lvl w:ilvl="8">
       <w:start w:val="1"/>
@@ -447,6 +572,7 @@
         </w:tabs>
         <w:ind w:left="3600" w:hanging="360"/>
       </w:pPr>
+      <w:rPr/>
     </w:lvl>
   </w:abstractNum>
   <w:abstractNum w:abstractNumId="2">
@@ -476,6 +602,7 @@
         </w:tabs>
         <w:ind w:left="1080" w:hanging="360"/>
       </w:pPr>
+      <w:rPr/>
     </w:lvl>
     <w:lvl w:ilvl="2">
       <w:start w:val="1"/>
@@ -488,6 +615,7 @@
         </w:tabs>
         <w:ind w:left="1440" w:hanging="360"/>
       </w:pPr>
+      <w:rPr/>
     </w:lvl>
     <w:lvl w:ilvl="3">
       <w:start w:val="1"/>
@@ -500,6 +628,7 @@
         </w:tabs>
         <w:ind w:left="1800" w:hanging="360"/>
       </w:pPr>
+      <w:rPr/>
     </w:lvl>
     <w:lvl w:ilvl="4">
       <w:start w:val="1"/>
@@ -512,6 +641,7 @@
         </w:tabs>
         <w:ind w:left="2160" w:hanging="360"/>
       </w:pPr>
+      <w:rPr/>
     </w:lvl>
     <w:lvl w:ilvl="5">
       <w:start w:val="1"/>
@@ -524,6 +654,7 @@
         </w:tabs>
         <w:ind w:left="2520" w:hanging="360"/>
       </w:pPr>
+      <w:rPr/>
     </w:lvl>
     <w:lvl w:ilvl="6">
       <w:start w:val="1"/>
@@ -536,6 +667,7 @@
         </w:tabs>
         <w:ind w:left="2880" w:hanging="360"/>
       </w:pPr>
+      <w:rPr/>
     </w:lvl>
     <w:lvl w:ilvl="7">
       <w:start w:val="1"/>
@@ -548,6 +680,7 @@
         </w:tabs>
         <w:ind w:left="3240" w:hanging="360"/>
       </w:pPr>
+      <w:rPr/>
     </w:lvl>
     <w:lvl w:ilvl="8">
       <w:start w:val="1"/>
@@ -560,6 +693,7 @@
         </w:tabs>
         <w:ind w:left="3600" w:hanging="360"/>
       </w:pPr>
+      <w:rPr/>
     </w:lvl>
   </w:abstractNum>
   <w:abstractNum w:abstractNumId="3">
@@ -589,6 +723,7 @@
         </w:tabs>
         <w:ind w:left="1080" w:hanging="360"/>
       </w:pPr>
+      <w:rPr/>
     </w:lvl>
     <w:lvl w:ilvl="2">
       <w:start w:val="1"/>
@@ -601,6 +736,7 @@
         </w:tabs>
         <w:ind w:left="1440" w:hanging="360"/>
       </w:pPr>
+      <w:rPr/>
     </w:lvl>
     <w:lvl w:ilvl="3">
       <w:start w:val="1"/>
@@ -613,6 +749,7 @@
         </w:tabs>
         <w:ind w:left="1800" w:hanging="360"/>
       </w:pPr>
+      <w:rPr/>
     </w:lvl>
     <w:lvl w:ilvl="4">
       <w:start w:val="1"/>
@@ -625,6 +762,7 @@
         </w:tabs>
         <w:ind w:left="2160" w:hanging="360"/>
       </w:pPr>
+      <w:rPr/>
     </w:lvl>
     <w:lvl w:ilvl="5">
       <w:start w:val="1"/>
@@ -637,6 +775,7 @@
         </w:tabs>
         <w:ind w:left="2520" w:hanging="360"/>
       </w:pPr>
+      <w:rPr/>
     </w:lvl>
     <w:lvl w:ilvl="6">
       <w:start w:val="1"/>
@@ -649,6 +788,7 @@
         </w:tabs>
         <w:ind w:left="2880" w:hanging="360"/>
       </w:pPr>
+      <w:rPr/>
     </w:lvl>
     <w:lvl w:ilvl="7">
       <w:start w:val="1"/>
@@ -661,6 +801,7 @@
         </w:tabs>
         <w:ind w:left="3240" w:hanging="360"/>
       </w:pPr>
+      <w:rPr/>
     </w:lvl>
     <w:lvl w:ilvl="8">
       <w:start w:val="1"/>
@@ -673,6 +814,7 @@
         </w:tabs>
         <w:ind w:left="3600" w:hanging="360"/>
       </w:pPr>
+      <w:rPr/>
     </w:lvl>
   </w:abstractNum>
   <w:abstractNum w:abstractNumId="4">
@@ -700,6 +842,7 @@
         </w:tabs>
         <w:ind w:left="1080" w:hanging="360"/>
       </w:pPr>
+      <w:rPr/>
     </w:lvl>
     <w:lvl w:ilvl="2">
       <w:start w:val="1"/>
@@ -712,6 +855,7 @@
         </w:tabs>
         <w:ind w:left="1440" w:hanging="360"/>
       </w:pPr>
+      <w:rPr/>
     </w:lvl>
     <w:lvl w:ilvl="3">
       <w:start w:val="1"/>
@@ -724,6 +868,7 @@
         </w:tabs>
         <w:ind w:left="1800" w:hanging="360"/>
       </w:pPr>
+      <w:rPr/>
     </w:lvl>
     <w:lvl w:ilvl="4">
       <w:start w:val="1"/>
@@ -736,6 +881,7 @@
         </w:tabs>
         <w:ind w:left="2160" w:hanging="360"/>
       </w:pPr>
+      <w:rPr/>
     </w:lvl>
     <w:lvl w:ilvl="5">
       <w:start w:val="1"/>
@@ -748,6 +894,7 @@
         </w:tabs>
         <w:ind w:left="2520" w:hanging="360"/>
       </w:pPr>
+      <w:rPr/>
     </w:lvl>
     <w:lvl w:ilvl="6">
       <w:start w:val="1"/>
@@ -760,6 +907,7 @@
         </w:tabs>
         <w:ind w:left="2880" w:hanging="360"/>
       </w:pPr>
+      <w:rPr/>
     </w:lvl>
     <w:lvl w:ilvl="7">
       <w:start w:val="1"/>
@@ -772,6 +920,7 @@
         </w:tabs>
         <w:ind w:left="3240" w:hanging="360"/>
       </w:pPr>
+      <w:rPr/>
     </w:lvl>
     <w:lvl w:ilvl="8">
       <w:start w:val="1"/>
@@ -784,6 +933,7 @@
         </w:tabs>
         <w:ind w:left="3600" w:hanging="360"/>
       </w:pPr>
+      <w:rPr/>
     </w:lvl>
   </w:abstractNum>
   <w:abstractNum w:abstractNumId="5">
@@ -811,6 +961,7 @@
         </w:tabs>
         <w:ind w:left="1080" w:hanging="360"/>
       </w:pPr>
+      <w:rPr/>
     </w:lvl>
     <w:lvl w:ilvl="2">
       <w:start w:val="1"/>
@@ -823,6 +974,7 @@
         </w:tabs>
         <w:ind w:left="1440" w:hanging="360"/>
       </w:pPr>
+      <w:rPr/>
     </w:lvl>
     <w:lvl w:ilvl="3">
       <w:start w:val="1"/>
@@ -835,6 +987,7 @@
         </w:tabs>
         <w:ind w:left="1800" w:hanging="360"/>
       </w:pPr>
+      <w:rPr/>
     </w:lvl>
     <w:lvl w:ilvl="4">
       <w:start w:val="1"/>
@@ -847,6 +1000,7 @@
         </w:tabs>
         <w:ind w:left="2160" w:hanging="360"/>
       </w:pPr>
+      <w:rPr/>
     </w:lvl>
     <w:lvl w:ilvl="5">
       <w:start w:val="1"/>
@@ -859,6 +1013,7 @@
         </w:tabs>
         <w:ind w:left="2520" w:hanging="360"/>
       </w:pPr>
+      <w:rPr/>
     </w:lvl>
     <w:lvl w:ilvl="6">
       <w:start w:val="1"/>
@@ -871,6 +1026,7 @@
         </w:tabs>
         <w:ind w:left="2880" w:hanging="360"/>
       </w:pPr>
+      <w:rPr/>
     </w:lvl>
     <w:lvl w:ilvl="7">
       <w:start w:val="1"/>
@@ -883,6 +1039,7 @@
         </w:tabs>
         <w:ind w:left="3240" w:hanging="360"/>
       </w:pPr>
+      <w:rPr/>
     </w:lvl>
     <w:lvl w:ilvl="8">
       <w:start w:val="1"/>
@@ -895,6 +1052,7 @@
         </w:tabs>
         <w:ind w:left="3600" w:hanging="360"/>
       </w:pPr>
+      <w:rPr/>
     </w:lvl>
   </w:abstractNum>
   <w:abstractNum w:abstractNumId="6">
@@ -922,6 +1080,7 @@
         </w:tabs>
         <w:ind w:left="1080" w:hanging="360"/>
       </w:pPr>
+      <w:rPr/>
     </w:lvl>
     <w:lvl w:ilvl="2">
       <w:start w:val="1"/>
@@ -934,6 +1093,7 @@
         </w:tabs>
         <w:ind w:left="1440" w:hanging="360"/>
       </w:pPr>
+      <w:rPr/>
     </w:lvl>
     <w:lvl w:ilvl="3">
       <w:start w:val="1"/>
@@ -946,6 +1106,7 @@
         </w:tabs>
         <w:ind w:left="1800" w:hanging="360"/>
       </w:pPr>
+      <w:rPr/>
     </w:lvl>
     <w:lvl w:ilvl="4">
       <w:start w:val="1"/>
@@ -958,6 +1119,7 @@
         </w:tabs>
         <w:ind w:left="2160" w:hanging="360"/>
       </w:pPr>
+      <w:rPr/>
     </w:lvl>
     <w:lvl w:ilvl="5">
       <w:start w:val="1"/>
@@ -970,6 +1132,7 @@
         </w:tabs>
         <w:ind w:left="2520" w:hanging="360"/>
       </w:pPr>
+      <w:rPr/>
     </w:lvl>
     <w:lvl w:ilvl="6">
       <w:start w:val="1"/>
@@ -982,6 +1145,7 @@
         </w:tabs>
         <w:ind w:left="2880" w:hanging="360"/>
       </w:pPr>
+      <w:rPr/>
     </w:lvl>
     <w:lvl w:ilvl="7">
       <w:start w:val="1"/>
@@ -994,6 +1158,7 @@
         </w:tabs>
         <w:ind w:left="3240" w:hanging="360"/>
       </w:pPr>
+      <w:rPr/>
     </w:lvl>
     <w:lvl w:ilvl="8">
       <w:start w:val="1"/>
@@ -1006,6 +1171,7 @@
         </w:tabs>
         <w:ind w:left="3600" w:hanging="360"/>
       </w:pPr>
+      <w:rPr/>
     </w:lvl>
   </w:abstractNum>
   <w:abstractNum w:abstractNumId="7">
@@ -1156,7 +1322,7 @@
   <w:docDefaults>
     <w:rPrDefault>
       <w:rPr>
-        <w:rFonts w:ascii="Cambria" w:hAnsi="Cambria" w:eastAsia="ＭＳ 明朝" w:cs="" w:asciiTheme="minorHAnsi" w:cstheme="minorBidi" w:eastAsiaTheme="minorEastAsia" w:hAnsiTheme="minorHAnsi"/>
+        <w:rFonts w:ascii="Cambria" w:hAnsi="Cambria" w:eastAsia="" w:cs="" w:asciiTheme="minorHAnsi" w:cstheme="minorBidi" w:eastAsiaTheme="minorEastAsia" w:hAnsiTheme="minorHAnsi"/>
         <w:sz w:val="22"/>
         <w:szCs w:val="22"/>
         <w:lang w:val="en-US" w:eastAsia="en-US" w:bidi="ar-SA"/>
@@ -1313,12 +1479,13 @@
     <w:rsid w:val="00fc693f"/>
     <w:pPr>
       <w:widowControl/>
+      <w:suppressAutoHyphens w:val="true"/>
       <w:bidi w:val="0"/>
       <w:spacing w:lineRule="auto" w:line="276" w:before="0" w:after="200"/>
       <w:jc w:val="left"/>
     </w:pPr>
     <w:rPr>
-      <w:rFonts w:ascii="Cambria" w:hAnsi="Cambria" w:eastAsia="ＭＳ 明朝" w:cs="" w:asciiTheme="minorHAnsi" w:cstheme="minorBidi" w:eastAsiaTheme="minorEastAsia" w:hAnsiTheme="minorHAnsi"/>
+      <w:rFonts w:ascii="Cambria" w:hAnsi="Cambria" w:eastAsia="" w:cs="" w:asciiTheme="minorHAnsi" w:cstheme="minorBidi" w:eastAsiaTheme="minorEastAsia" w:hAnsiTheme="minorHAnsi"/>
       <w:color w:val="auto"/>
       <w:kern w:val="0"/>
       <w:sz w:val="22"/>
@@ -1341,7 +1508,7 @@
       <w:outlineLvl w:val="0"/>
     </w:pPr>
     <w:rPr>
-      <w:rFonts w:ascii="Calibri" w:hAnsi="Calibri" w:eastAsia="ＭＳ ゴシック" w:cs="" w:asciiTheme="majorHAnsi" w:cstheme="majorBidi" w:eastAsiaTheme="majorEastAsia" w:hAnsiTheme="majorHAnsi"/>
+      <w:rFonts w:ascii="Calibri" w:hAnsi="Calibri" w:eastAsia="" w:cs="" w:asciiTheme="majorHAnsi" w:cstheme="majorBidi" w:eastAsiaTheme="majorEastAsia" w:hAnsiTheme="majorHAnsi"/>
       <w:b/>
       <w:bCs/>
       <w:color w:themeColor="accent1" w:themeShade="bf" w:val="365F91"/>
@@ -1365,7 +1532,7 @@
       <w:outlineLvl w:val="1"/>
     </w:pPr>
     <w:rPr>
-      <w:rFonts w:ascii="Calibri" w:hAnsi="Calibri" w:eastAsia="ＭＳ ゴシック" w:cs="" w:asciiTheme="majorHAnsi" w:cstheme="majorBidi" w:eastAsiaTheme="majorEastAsia" w:hAnsiTheme="majorHAnsi"/>
+      <w:rFonts w:ascii="Calibri" w:hAnsi="Calibri" w:eastAsia="" w:cs="" w:asciiTheme="majorHAnsi" w:cstheme="majorBidi" w:eastAsiaTheme="majorEastAsia" w:hAnsiTheme="majorHAnsi"/>
       <w:b/>
       <w:bCs/>
       <w:color w:themeColor="accent1" w:val="4F81BD"/>
@@ -1389,7 +1556,7 @@
       <w:outlineLvl w:val="2"/>
     </w:pPr>
     <w:rPr>
-      <w:rFonts w:ascii="Calibri" w:hAnsi="Calibri" w:eastAsia="ＭＳ ゴシック" w:cs="" w:asciiTheme="majorHAnsi" w:cstheme="majorBidi" w:eastAsiaTheme="majorEastAsia" w:hAnsiTheme="majorHAnsi"/>
+      <w:rFonts w:ascii="Calibri" w:hAnsi="Calibri" w:eastAsia="" w:cs="" w:asciiTheme="majorHAnsi" w:cstheme="majorBidi" w:eastAsiaTheme="majorEastAsia" w:hAnsiTheme="majorHAnsi"/>
       <w:b/>
       <w:bCs/>
       <w:color w:themeColor="accent1" w:val="4F81BD"/>
@@ -1412,7 +1579,7 @@
       <w:outlineLvl w:val="3"/>
     </w:pPr>
     <w:rPr>
-      <w:rFonts w:ascii="Calibri" w:hAnsi="Calibri" w:eastAsia="ＭＳ ゴシック" w:cs="" w:asciiTheme="majorHAnsi" w:cstheme="majorBidi" w:eastAsiaTheme="majorEastAsia" w:hAnsiTheme="majorHAnsi"/>
+      <w:rFonts w:ascii="Calibri" w:hAnsi="Calibri" w:eastAsia="" w:cs="" w:asciiTheme="majorHAnsi" w:cstheme="majorBidi" w:eastAsiaTheme="majorEastAsia" w:hAnsiTheme="majorHAnsi"/>
       <w:b/>
       <w:bCs/>
       <w:i/>
@@ -1437,7 +1604,7 @@
       <w:outlineLvl w:val="4"/>
     </w:pPr>
     <w:rPr>
-      <w:rFonts w:ascii="Calibri" w:hAnsi="Calibri" w:eastAsia="ＭＳ ゴシック" w:cs="" w:asciiTheme="majorHAnsi" w:cstheme="majorBidi" w:eastAsiaTheme="majorEastAsia" w:hAnsiTheme="majorHAnsi"/>
+      <w:rFonts w:ascii="Calibri" w:hAnsi="Calibri" w:eastAsia="" w:cs="" w:asciiTheme="majorHAnsi" w:cstheme="majorBidi" w:eastAsiaTheme="majorEastAsia" w:hAnsiTheme="majorHAnsi"/>
       <w:color w:themeColor="accent1" w:themeShade="7f" w:val="243F60"/>
     </w:rPr>
   </w:style>
@@ -1458,7 +1625,7 @@
       <w:outlineLvl w:val="5"/>
     </w:pPr>
     <w:rPr>
-      <w:rFonts w:ascii="Calibri" w:hAnsi="Calibri" w:eastAsia="ＭＳ ゴシック" w:cs="" w:asciiTheme="majorHAnsi" w:cstheme="majorBidi" w:eastAsiaTheme="majorEastAsia" w:hAnsiTheme="majorHAnsi"/>
+      <w:rFonts w:ascii="Calibri" w:hAnsi="Calibri" w:eastAsia="" w:cs="" w:asciiTheme="majorHAnsi" w:cstheme="majorBidi" w:eastAsiaTheme="majorEastAsia" w:hAnsiTheme="majorHAnsi"/>
       <w:i/>
       <w:iCs/>
       <w:color w:themeColor="accent1" w:themeShade="7f" w:val="243F60"/>
@@ -1481,7 +1648,7 @@
       <w:outlineLvl w:val="6"/>
     </w:pPr>
     <w:rPr>
-      <w:rFonts w:ascii="Calibri" w:hAnsi="Calibri" w:eastAsia="ＭＳ ゴシック" w:cs="" w:asciiTheme="majorHAnsi" w:cstheme="majorBidi" w:eastAsiaTheme="majorEastAsia" w:hAnsiTheme="majorHAnsi"/>
+      <w:rFonts w:ascii="Calibri" w:hAnsi="Calibri" w:eastAsia="" w:cs="" w:asciiTheme="majorHAnsi" w:cstheme="majorBidi" w:eastAsiaTheme="majorEastAsia" w:hAnsiTheme="majorHAnsi"/>
       <w:i/>
       <w:iCs/>
       <w:color w:themeColor="text1" w:themeTint="bf" w:val="404040"/>
@@ -1504,7 +1671,7 @@
       <w:outlineLvl w:val="7"/>
     </w:pPr>
     <w:rPr>
-      <w:rFonts w:ascii="Calibri" w:hAnsi="Calibri" w:eastAsia="ＭＳ ゴシック" w:cs="" w:asciiTheme="majorHAnsi" w:cstheme="majorBidi" w:eastAsiaTheme="majorEastAsia" w:hAnsiTheme="majorHAnsi"/>
+      <w:rFonts w:ascii="Calibri" w:hAnsi="Calibri" w:eastAsia="" w:cs="" w:asciiTheme="majorHAnsi" w:cstheme="majorBidi" w:eastAsiaTheme="majorEastAsia" w:hAnsiTheme="majorHAnsi"/>
       <w:color w:themeColor="accent1" w:val="4F81BD"/>
       <w:sz w:val="20"/>
       <w:szCs w:val="20"/>
@@ -1527,7 +1694,7 @@
       <w:outlineLvl w:val="8"/>
     </w:pPr>
     <w:rPr>
-      <w:rFonts w:ascii="Calibri" w:hAnsi="Calibri" w:eastAsia="ＭＳ ゴシック" w:cs="" w:asciiTheme="majorHAnsi" w:cstheme="majorBidi" w:eastAsiaTheme="majorEastAsia" w:hAnsiTheme="majorHAnsi"/>
+      <w:rFonts w:ascii="Calibri" w:hAnsi="Calibri" w:eastAsia="" w:cs="" w:asciiTheme="majorHAnsi" w:cstheme="majorBidi" w:eastAsiaTheme="majorEastAsia" w:hAnsiTheme="majorHAnsi"/>
       <w:i/>
       <w:iCs/>
       <w:color w:themeColor="text1" w:themeTint="bf" w:val="404040"/>
@@ -1566,7 +1733,7 @@
     <w:qFormat/>
     <w:rsid w:val="00fc693f"/>
     <w:rPr>
-      <w:rFonts w:ascii="Calibri" w:hAnsi="Calibri" w:eastAsia="ＭＳ ゴシック" w:cs="" w:asciiTheme="majorHAnsi" w:cstheme="majorBidi" w:eastAsiaTheme="majorEastAsia" w:hAnsiTheme="majorHAnsi"/>
+      <w:rFonts w:ascii="Calibri" w:hAnsi="Calibri" w:eastAsia="" w:cs="" w:asciiTheme="majorHAnsi" w:cstheme="majorBidi" w:eastAsiaTheme="majorEastAsia" w:hAnsiTheme="majorHAnsi"/>
       <w:b/>
       <w:bCs/>
       <w:color w:themeColor="accent1" w:themeShade="bf" w:val="365F91"/>
@@ -1581,7 +1748,7 @@
     <w:qFormat/>
     <w:rsid w:val="00fc693f"/>
     <w:rPr>
-      <w:rFonts w:ascii="Calibri" w:hAnsi="Calibri" w:eastAsia="ＭＳ ゴシック" w:cs="" w:asciiTheme="majorHAnsi" w:cstheme="majorBidi" w:eastAsiaTheme="majorEastAsia" w:hAnsiTheme="majorHAnsi"/>
+      <w:rFonts w:ascii="Calibri" w:hAnsi="Calibri" w:eastAsia="" w:cs="" w:asciiTheme="majorHAnsi" w:cstheme="majorBidi" w:eastAsiaTheme="majorEastAsia" w:hAnsiTheme="majorHAnsi"/>
       <w:b/>
       <w:bCs/>
       <w:color w:themeColor="accent1" w:val="4F81BD"/>
@@ -1596,7 +1763,7 @@
     <w:qFormat/>
     <w:rsid w:val="00fc693f"/>
     <w:rPr>
-      <w:rFonts w:ascii="Calibri" w:hAnsi="Calibri" w:eastAsia="ＭＳ ゴシック" w:cs="" w:asciiTheme="majorHAnsi" w:cstheme="majorBidi" w:eastAsiaTheme="majorEastAsia" w:hAnsiTheme="majorHAnsi"/>
+      <w:rFonts w:ascii="Calibri" w:hAnsi="Calibri" w:eastAsia="" w:cs="" w:asciiTheme="majorHAnsi" w:cstheme="majorBidi" w:eastAsiaTheme="majorEastAsia" w:hAnsiTheme="majorHAnsi"/>
       <w:b/>
       <w:bCs/>
       <w:color w:themeColor="accent1" w:val="4F81BD"/>
@@ -1609,7 +1776,7 @@
     <w:qFormat/>
     <w:rsid w:val="00fc693f"/>
     <w:rPr>
-      <w:rFonts w:ascii="Calibri" w:hAnsi="Calibri" w:eastAsia="ＭＳ ゴシック" w:cs="" w:asciiTheme="majorHAnsi" w:cstheme="majorBidi" w:eastAsiaTheme="majorEastAsia" w:hAnsiTheme="majorHAnsi"/>
+      <w:rFonts w:ascii="Calibri" w:hAnsi="Calibri" w:eastAsia="" w:cs="" w:asciiTheme="majorHAnsi" w:cstheme="majorBidi" w:eastAsiaTheme="majorEastAsia" w:hAnsiTheme="majorHAnsi"/>
       <w:color w:themeColor="text2" w:themeShade="bf" w:val="17365D"/>
       <w:spacing w:val="5"/>
       <w:kern w:val="2"/>
@@ -1624,7 +1791,7 @@
     <w:qFormat/>
     <w:rsid w:val="00fc693f"/>
     <w:rPr>
-      <w:rFonts w:ascii="Calibri" w:hAnsi="Calibri" w:eastAsia="ＭＳ ゴシック" w:cs="" w:asciiTheme="majorHAnsi" w:cstheme="majorBidi" w:eastAsiaTheme="majorEastAsia" w:hAnsiTheme="majorHAnsi"/>
+      <w:rFonts w:ascii="Calibri" w:hAnsi="Calibri" w:eastAsia="" w:cs="" w:asciiTheme="majorHAnsi" w:cstheme="majorBidi" w:eastAsiaTheme="majorEastAsia" w:hAnsiTheme="majorHAnsi"/>
       <w:i/>
       <w:iCs/>
       <w:color w:themeColor="accent1" w:val="4F81BD"/>
@@ -1696,7 +1863,7 @@
     <w:qFormat/>
     <w:rsid w:val="00fc693f"/>
     <w:rPr>
-      <w:rFonts w:ascii="Calibri" w:hAnsi="Calibri" w:eastAsia="ＭＳ ゴシック" w:cs="" w:asciiTheme="majorHAnsi" w:cstheme="majorBidi" w:eastAsiaTheme="majorEastAsia" w:hAnsiTheme="majorHAnsi"/>
+      <w:rFonts w:ascii="Calibri" w:hAnsi="Calibri" w:eastAsia="" w:cs="" w:asciiTheme="majorHAnsi" w:cstheme="majorBidi" w:eastAsiaTheme="majorEastAsia" w:hAnsiTheme="majorHAnsi"/>
       <w:b/>
       <w:bCs/>
       <w:i/>
@@ -1712,7 +1879,7 @@
     <w:qFormat/>
     <w:rsid w:val="00fc693f"/>
     <w:rPr>
-      <w:rFonts w:ascii="Calibri" w:hAnsi="Calibri" w:eastAsia="ＭＳ ゴシック" w:cs="" w:asciiTheme="majorHAnsi" w:cstheme="majorBidi" w:eastAsiaTheme="majorEastAsia" w:hAnsiTheme="majorHAnsi"/>
+      <w:rFonts w:ascii="Calibri" w:hAnsi="Calibri" w:eastAsia="" w:cs="" w:asciiTheme="majorHAnsi" w:cstheme="majorBidi" w:eastAsiaTheme="majorEastAsia" w:hAnsiTheme="majorHAnsi"/>
       <w:color w:themeColor="accent1" w:themeShade="7f" w:val="243F60"/>
     </w:rPr>
   </w:style>
@@ -1724,7 +1891,7 @@
     <w:qFormat/>
     <w:rsid w:val="00fc693f"/>
     <w:rPr>
-      <w:rFonts w:ascii="Calibri" w:hAnsi="Calibri" w:eastAsia="ＭＳ ゴシック" w:cs="" w:asciiTheme="majorHAnsi" w:cstheme="majorBidi" w:eastAsiaTheme="majorEastAsia" w:hAnsiTheme="majorHAnsi"/>
+      <w:rFonts w:ascii="Calibri" w:hAnsi="Calibri" w:eastAsia="" w:cs="" w:asciiTheme="majorHAnsi" w:cstheme="majorBidi" w:eastAsiaTheme="majorEastAsia" w:hAnsiTheme="majorHAnsi"/>
       <w:i/>
       <w:iCs/>
       <w:color w:themeColor="accent1" w:themeShade="7f" w:val="243F60"/>
@@ -1738,7 +1905,7 @@
     <w:qFormat/>
     <w:rsid w:val="00fc693f"/>
     <w:rPr>
-      <w:rFonts w:ascii="Calibri" w:hAnsi="Calibri" w:eastAsia="ＭＳ ゴシック" w:cs="" w:asciiTheme="majorHAnsi" w:cstheme="majorBidi" w:eastAsiaTheme="majorEastAsia" w:hAnsiTheme="majorHAnsi"/>
+      <w:rFonts w:ascii="Calibri" w:hAnsi="Calibri" w:eastAsia="" w:cs="" w:asciiTheme="majorHAnsi" w:cstheme="majorBidi" w:eastAsiaTheme="majorEastAsia" w:hAnsiTheme="majorHAnsi"/>
       <w:i/>
       <w:iCs/>
       <w:color w:themeColor="text1" w:themeTint="bf" w:val="404040"/>
@@ -1752,7 +1919,7 @@
     <w:qFormat/>
     <w:rsid w:val="00fc693f"/>
     <w:rPr>
-      <w:rFonts w:ascii="Calibri" w:hAnsi="Calibri" w:eastAsia="ＭＳ ゴシック" w:cs="" w:asciiTheme="majorHAnsi" w:cstheme="majorBidi" w:eastAsiaTheme="majorEastAsia" w:hAnsiTheme="majorHAnsi"/>
+      <w:rFonts w:ascii="Calibri" w:hAnsi="Calibri" w:eastAsia="" w:cs="" w:asciiTheme="majorHAnsi" w:cstheme="majorBidi" w:eastAsiaTheme="majorEastAsia" w:hAnsiTheme="majorHAnsi"/>
       <w:color w:themeColor="accent1" w:val="4F81BD"/>
       <w:sz w:val="20"/>
       <w:szCs w:val="20"/>
@@ -1766,7 +1933,7 @@
     <w:qFormat/>
     <w:rsid w:val="00fc693f"/>
     <w:rPr>
-      <w:rFonts w:ascii="Calibri" w:hAnsi="Calibri" w:eastAsia="ＭＳ ゴシック" w:cs="" w:asciiTheme="majorHAnsi" w:cstheme="majorBidi" w:eastAsiaTheme="majorEastAsia" w:hAnsiTheme="majorHAnsi"/>
+      <w:rFonts w:ascii="Calibri" w:hAnsi="Calibri" w:eastAsia="" w:cs="" w:asciiTheme="majorHAnsi" w:cstheme="majorBidi" w:eastAsiaTheme="majorEastAsia" w:hAnsiTheme="majorHAnsi"/>
       <w:i/>
       <w:iCs/>
       <w:color w:themeColor="text1" w:themeTint="bf" w:val="404040"/>
@@ -1996,12 +2163,13 @@
     <w:rsid w:val="00fc693f"/>
     <w:pPr>
       <w:widowControl/>
+      <w:suppressAutoHyphens w:val="true"/>
       <w:bidi w:val="0"/>
       <w:spacing w:lineRule="auto" w:line="240" w:before="0" w:after="0"/>
       <w:jc w:val="left"/>
     </w:pPr>
     <w:rPr>
-      <w:rFonts w:ascii="Cambria" w:hAnsi="Cambria" w:eastAsia="ＭＳ 明朝" w:cs="" w:asciiTheme="minorHAnsi" w:cstheme="minorBidi" w:eastAsiaTheme="minorEastAsia" w:hAnsiTheme="minorHAnsi"/>
+      <w:rFonts w:ascii="Cambria" w:hAnsi="Cambria" w:eastAsia="" w:cs="" w:asciiTheme="minorHAnsi" w:cstheme="minorBidi" w:eastAsiaTheme="minorEastAsia" w:hAnsiTheme="minorHAnsi"/>
       <w:color w:val="auto"/>
       <w:kern w:val="0"/>
       <w:sz w:val="22"/>
@@ -2025,7 +2193,7 @@
       <w:contextualSpacing/>
     </w:pPr>
     <w:rPr>
-      <w:rFonts w:ascii="Calibri" w:hAnsi="Calibri" w:eastAsia="ＭＳ ゴシック" w:cs="" w:asciiTheme="majorHAnsi" w:cstheme="majorBidi" w:eastAsiaTheme="majorEastAsia" w:hAnsiTheme="majorHAnsi"/>
+      <w:rFonts w:ascii="Calibri" w:hAnsi="Calibri" w:eastAsia="" w:cs="" w:asciiTheme="majorHAnsi" w:cstheme="majorBidi" w:eastAsiaTheme="majorEastAsia" w:hAnsiTheme="majorHAnsi"/>
       <w:color w:themeColor="text2" w:themeShade="bf" w:val="17365D"/>
       <w:spacing w:val="5"/>
       <w:kern w:val="2"/>
@@ -2043,7 +2211,7 @@
     <w:rsid w:val="00fc693f"/>
     <w:pPr/>
     <w:rPr>
-      <w:rFonts w:ascii="Calibri" w:hAnsi="Calibri" w:eastAsia="ＭＳ ゴシック" w:cs="" w:asciiTheme="majorHAnsi" w:cstheme="majorBidi" w:eastAsiaTheme="majorEastAsia" w:hAnsiTheme="majorHAnsi"/>
+      <w:rFonts w:ascii="Calibri" w:hAnsi="Calibri" w:eastAsia="" w:cs="" w:asciiTheme="majorHAnsi" w:cstheme="majorBidi" w:eastAsiaTheme="majorEastAsia" w:hAnsiTheme="majorHAnsi"/>
       <w:i/>
       <w:iCs/>
       <w:color w:themeColor="accent1" w:val="4F81BD"/>
@@ -2276,12 +2444,13 @@
         <w:tab w:val="left" w:pos="3456" w:leader="none"/>
         <w:tab w:val="left" w:pos="4032" w:leader="none"/>
       </w:tabs>
+      <w:suppressAutoHyphens w:val="true"/>
       <w:bidi w:val="0"/>
       <w:spacing w:lineRule="auto" w:line="276" w:before="0" w:after="200"/>
       <w:jc w:val="left"/>
     </w:pPr>
     <w:rPr>
-      <w:rFonts w:ascii="Courier" w:hAnsi="Courier" w:eastAsia="ＭＳ 明朝" w:cs="" w:cstheme="minorBidi" w:eastAsiaTheme="minorEastAsia"/>
+      <w:rFonts w:ascii="Courier" w:hAnsi="Courier" w:eastAsia="" w:cs="" w:cstheme="minorBidi" w:eastAsiaTheme="minorEastAsia"/>
       <w:color w:val="auto"/>
       <w:kern w:val="0"/>
       <w:sz w:val="20"/>
@@ -5479,7 +5648,6 @@
       <w:pPr>
         <w:spacing w:before="0" w:after="0" w:line="240" w:lineRule="auto"/>
       </w:pPr>
-      <w:rPr/>
       <w:tblPr/>
       <w:tcPr>
         <w:tcBorders>
@@ -5625,7 +5793,6 @@
       <w:pPr>
         <w:spacing w:before="0" w:after="0" w:line="240" w:lineRule="auto"/>
       </w:pPr>
-      <w:rPr/>
       <w:tblPr/>
       <w:tcPr>
         <w:tcBorders>
@@ -5771,7 +5938,6 @@
       <w:pPr>
         <w:spacing w:before="0" w:after="0" w:line="240" w:lineRule="auto"/>
       </w:pPr>
-      <w:rPr/>
       <w:tblPr/>
       <w:tcPr>
         <w:tcBorders>
@@ -5917,7 +6083,6 @@
       <w:pPr>
         <w:spacing w:before="0" w:after="0" w:line="240" w:lineRule="auto"/>
       </w:pPr>
-      <w:rPr/>
       <w:tblPr/>
       <w:tcPr>
         <w:tcBorders>
@@ -6063,7 +6228,6 @@
       <w:pPr>
         <w:spacing w:before="0" w:after="0" w:line="240" w:lineRule="auto"/>
       </w:pPr>
-      <w:rPr/>
       <w:tblPr/>
       <w:tcPr>
         <w:tcBorders>
@@ -6209,7 +6373,6 @@
       <w:pPr>
         <w:spacing w:before="0" w:after="0" w:line="240" w:lineRule="auto"/>
       </w:pPr>
-      <w:rPr/>
       <w:tblPr/>
       <w:tcPr>
         <w:tcBorders>
@@ -6355,7 +6518,6 @@
       <w:pPr>
         <w:spacing w:before="0" w:after="0" w:line="240" w:lineRule="auto"/>
       </w:pPr>
-      <w:rPr/>
       <w:tblPr/>
       <w:tcPr>
         <w:tcBorders>

</xml_diff>